<commit_message>
thesis doc: add missing Sequence Diagram + UI wireframe to chapter 3
- 6.6 แผนภาพลำดับ (Sequence Diagram) — analyze() interaction (was generated but
  never placed in the document)
- 6.9 การออกแบบส่วนติดต่อผู้ใช้ — Gradio wireframe
- renumber design subsections 6.6→6.9; drop the one hardcoded "ภาพ 15" ref
Now 18 figures / 15 tables.

Co-Authored-By: Claude Sonnet 5 <noreply@anthropic.com>
Claude-Session: https://claude.ai/code/session_018gchiU5j53bcZCXo2Ma7ui
</commit_message>
<xml_diff>
--- a/docs/ภาคนิพนธ์_ระบบตรวจจับตำหนิผิวเหล็ก_บท1-3.docx
+++ b/docs/ภาคนิพนธ์_ระบบตรวจจับตำหนิผิวเหล็ก_บท1-3.docx
@@ -8153,7 +8153,99 @@
         <w:spacing w:before="240" w:after="120"/>
       </w:pPr>
       <w:r>
-        <w:t>6.6 แผนภาพกิจกรรมและสถานะ (Activity &amp; State Diagram)</w:t>
+        <w:t>6.6 แผนภาพลำดับ (Sequence Diagram)</w:t>
+      </w:r>
+    </w:p>
+    <w:p>
+      <w:pPr>
+        <w:spacing w:after="120" w:line="276" w:lineRule="auto"/>
+        <w:ind w:firstLine="720"/>
+      </w:pPr>
+      <w:r>
+        <w:t>แผนภาพลำดับแสดงการโต้ตอบระหว่างวัตถุ/โมดูลเมื่อผู้ใช้กดปุ่ม "ตรวจสอบ" บนหน้าเว็บ ตั้งแต่การ โหลดแบบจำลองครั้งแรก การเรียก Stage 1 (DMS46) การสร้างบริเวณและ fallback การวนเรียก Stage 2 (YOLO11) ต่อบริเวณ การรวมผลด้วย Cross-region NMS จนถึงการวาดผลและส่งค่ากลับหน้าเว็บ</w:t>
+      </w:r>
+    </w:p>
+    <w:p>
+      <w:pPr>
+        <w:spacing w:before="120"/>
+        <w:jc w:val="center"/>
+      </w:pPr>
+      <w:r>
+        <w:drawing>
+          <wp:inline xmlns:a="http://schemas.openxmlformats.org/drawingml/2006/main" xmlns:pic="http://schemas.openxmlformats.org/drawingml/2006/picture">
+            <wp:extent cx="5852160" cy="5569047"/>
+            <wp:docPr id="13" name="Picture 13"/>
+            <wp:cNvGraphicFramePr>
+              <a:graphicFrameLocks noChangeAspect="1"/>
+            </wp:cNvGraphicFramePr>
+            <a:graphic>
+              <a:graphicData uri="http://schemas.openxmlformats.org/drawingml/2006/picture">
+                <pic:pic>
+                  <pic:nvPicPr>
+                    <pic:cNvPr id="0" name="uml_7_sequence.png"/>
+                    <pic:cNvPicPr/>
+                  </pic:nvPicPr>
+                  <pic:blipFill>
+                    <a:blip r:embed="rId21"/>
+                    <a:stretch>
+                      <a:fillRect/>
+                    </a:stretch>
+                  </pic:blipFill>
+                  <pic:spPr>
+                    <a:xfrm>
+                      <a:off x="0" y="0"/>
+                      <a:ext cx="5852160" cy="5569047"/>
+                    </a:xfrm>
+                    <a:prstGeom prst="rect"/>
+                  </pic:spPr>
+                </pic:pic>
+              </a:graphicData>
+            </a:graphic>
+          </wp:inline>
+        </w:drawing>
+      </w:r>
+    </w:p>
+    <w:p>
+      <w:pPr>
+        <w:spacing w:after="240" w:before="0"/>
+        <w:jc w:val="center"/>
+      </w:pPr>
+      <w:r>
+        <w:rPr>
+          <w:rFonts w:ascii="TH Sarabun New" w:hAnsi="TH Sarabun New"/>
+          <w:b w:val="0"/>
+          <w:sz w:val="28"/>
+        </w:rPr>
+        <w:t xml:space="preserve">ภาพ </w:t>
+      </w:r>
+      <w:r>
+        <w:rPr>
+          <w:rFonts w:ascii="TH Sarabun New" w:hAnsi="TH Sarabun New"/>
+          <w:b w:val="0"/>
+          <w:sz w:val="28"/>
+        </w:rPr>
+        <w:fldChar w:fldCharType="begin"/>
+        <w:instrText xml:space="preserve"> SEQ ภาพ \* ARABIC </w:instrText>
+        <w:fldChar w:fldCharType="separate"/>
+        <w:t>0</w:t>
+        <w:fldChar w:fldCharType="end"/>
+      </w:r>
+      <w:r>
+        <w:rPr>
+          <w:rFonts w:ascii="TH Sarabun New" w:hAnsi="TH Sarabun New"/>
+          <w:b w:val="0"/>
+          <w:sz w:val="28"/>
+        </w:rPr>
+        <w:t xml:space="preserve">  แผนภาพลำดับของฟังก์ชัน analyze() เมื่อผู้ใช้สั่งตรวจภาพ</w:t>
+      </w:r>
+    </w:p>
+    <w:p>
+      <w:pPr>
+        <w:pStyle w:val="Heading3"/>
+        <w:spacing w:before="240" w:after="120"/>
+      </w:pPr>
+      <w:r>
+        <w:t>6.7 แผนภาพกิจกรรมและสถานะ (Activity &amp; State Diagram)</w:t>
       </w:r>
     </w:p>
     <w:p>
@@ -8165,7 +8257,7 @@
         <w:drawing>
           <wp:inline xmlns:a="http://schemas.openxmlformats.org/drawingml/2006/main" xmlns:pic="http://schemas.openxmlformats.org/drawingml/2006/picture">
             <wp:extent cx="3657600" cy="6537266"/>
-            <wp:docPr id="13" name="Picture 13"/>
+            <wp:docPr id="14" name="Picture 14"/>
             <wp:cNvGraphicFramePr>
               <a:graphicFrameLocks noChangeAspect="1"/>
             </wp:cNvGraphicFramePr>
@@ -8177,7 +8269,7 @@
                     <pic:cNvPicPr/>
                   </pic:nvPicPr>
                   <pic:blipFill>
-                    <a:blip r:embed="rId21"/>
+                    <a:blip r:embed="rId22"/>
                     <a:stretch>
                       <a:fillRect/>
                     </a:stretch>
@@ -8239,7 +8331,7 @@
         <w:drawing>
           <wp:inline xmlns:a="http://schemas.openxmlformats.org/drawingml/2006/main" xmlns:pic="http://schemas.openxmlformats.org/drawingml/2006/picture">
             <wp:extent cx="5760720" cy="2492513"/>
-            <wp:docPr id="14" name="Picture 14"/>
+            <wp:docPr id="15" name="Picture 15"/>
             <wp:cNvGraphicFramePr>
               <a:graphicFrameLocks noChangeAspect="1"/>
             </wp:cNvGraphicFramePr>
@@ -8251,7 +8343,7 @@
                     <pic:cNvPicPr/>
                   </pic:nvPicPr>
                   <pic:blipFill>
-                    <a:blip r:embed="rId22"/>
+                    <a:blip r:embed="rId23"/>
                     <a:stretch>
                       <a:fillRect/>
                     </a:stretch>
@@ -8310,7 +8402,7 @@
         <w:spacing w:before="240" w:after="120"/>
       </w:pPr>
       <w:r>
-        <w:t>6.7 แผนภาพคลาส (Class Diagram)</w:t>
+        <w:t>6.8 แผนภาพคลาส (Class Diagram)</w:t>
       </w:r>
     </w:p>
     <w:p>
@@ -8319,7 +8411,7 @@
         <w:ind w:firstLine="720"/>
       </w:pPr>
       <w:r>
-        <w:t>ระบบพัฒนาแบบ functional โดยแต่ละโมดูล (pipeline, app, evaluate*) มีลักษณะเป็นชุดฟังก์ชันสาธารณะ (stereotype «utility») และ dict payload (Detection, RegionMeta, Summary) ที่ส่งต่อระหว่างฟังก์ชัน แสดงในภาพ 15</w:t>
+        <w:t>ระบบพัฒนาแบบ functional โดยแต่ละโมดูล (pipeline, app, evaluate*) มีลักษณะเป็นชุดฟังก์ชันสาธารณะ (stereotype «utility») และ dict payload (Detection, RegionMeta, Summary) ที่ส่งต่อระหว่างฟังก์ชัน ดังแผนภาพคลาสต่อไปนี้</w:t>
       </w:r>
     </w:p>
     <w:p>
@@ -8331,7 +8423,7 @@
         <w:drawing>
           <wp:inline xmlns:a="http://schemas.openxmlformats.org/drawingml/2006/main" xmlns:pic="http://schemas.openxmlformats.org/drawingml/2006/picture">
             <wp:extent cx="5486400" cy="7478590"/>
-            <wp:docPr id="15" name="Picture 15"/>
+            <wp:docPr id="16" name="Picture 16"/>
             <wp:cNvGraphicFramePr>
               <a:graphicFrameLocks noChangeAspect="1"/>
             </wp:cNvGraphicFramePr>
@@ -8343,7 +8435,7 @@
                     <pic:cNvPicPr/>
                   </pic:nvPicPr>
                   <pic:blipFill>
-                    <a:blip r:embed="rId23"/>
+                    <a:blip r:embed="rId24"/>
                     <a:stretch>
                       <a:fillRect/>
                     </a:stretch>
@@ -8398,6 +8490,98 @@
     </w:p>
     <w:p>
       <w:pPr>
+        <w:pStyle w:val="Heading3"/>
+        <w:spacing w:before="240" w:after="120"/>
+      </w:pPr>
+      <w:r>
+        <w:t>6.9 การออกแบบส่วนติดต่อผู้ใช้ (User Interface Design)</w:t>
+      </w:r>
+    </w:p>
+    <w:p>
+      <w:pPr>
+        <w:spacing w:after="120" w:line="276" w:lineRule="auto"/>
+        <w:ind w:firstLine="720"/>
+      </w:pPr>
+      <w:r>
+        <w:t>หน้าเว็บ (Gradio) ออกแบบให้มีขั้นตอนเดียว: อัปโหลดหรือวางภาพ ระบบตรวจให้อัตโนมัติ แล้วแสดงการ์ด สรุปผล ภาพผลพร้อมกรอบและป้ายภาษาไทย ตารางรายการตำหนิเรียงตามระดับความเสี่ยง และส่วนขยายแสดงภาพ ผลของ Stage 1 โครงหน้าจอโดยรวมแสดงในภาพต่อไปนี้</w:t>
+      </w:r>
+    </w:p>
+    <w:p>
+      <w:pPr>
+        <w:spacing w:before="120"/>
+        <w:jc w:val="center"/>
+      </w:pPr>
+      <w:r>
+        <w:drawing>
+          <wp:inline xmlns:a="http://schemas.openxmlformats.org/drawingml/2006/main" xmlns:pic="http://schemas.openxmlformats.org/drawingml/2006/picture">
+            <wp:extent cx="5669280" cy="4132783"/>
+            <wp:docPr id="17" name="Picture 17"/>
+            <wp:cNvGraphicFramePr>
+              <a:graphicFrameLocks noChangeAspect="1"/>
+            </wp:cNvGraphicFramePr>
+            <a:graphic>
+              <a:graphicData uri="http://schemas.openxmlformats.org/drawingml/2006/picture">
+                <pic:pic>
+                  <pic:nvPicPr>
+                    <pic:cNvPr id="0" name="ui_wireframe.png"/>
+                    <pic:cNvPicPr/>
+                  </pic:nvPicPr>
+                  <pic:blipFill>
+                    <a:blip r:embed="rId25"/>
+                    <a:stretch>
+                      <a:fillRect/>
+                    </a:stretch>
+                  </pic:blipFill>
+                  <pic:spPr>
+                    <a:xfrm>
+                      <a:off x="0" y="0"/>
+                      <a:ext cx="5669280" cy="4132783"/>
+                    </a:xfrm>
+                    <a:prstGeom prst="rect"/>
+                  </pic:spPr>
+                </pic:pic>
+              </a:graphicData>
+            </a:graphic>
+          </wp:inline>
+        </w:drawing>
+      </w:r>
+    </w:p>
+    <w:p>
+      <w:pPr>
+        <w:spacing w:after="240" w:before="0"/>
+        <w:jc w:val="center"/>
+      </w:pPr>
+      <w:r>
+        <w:rPr>
+          <w:rFonts w:ascii="TH Sarabun New" w:hAnsi="TH Sarabun New"/>
+          <w:b w:val="0"/>
+          <w:sz w:val="28"/>
+        </w:rPr>
+        <w:t xml:space="preserve">ภาพ </w:t>
+      </w:r>
+      <w:r>
+        <w:rPr>
+          <w:rFonts w:ascii="TH Sarabun New" w:hAnsi="TH Sarabun New"/>
+          <w:b w:val="0"/>
+          <w:sz w:val="28"/>
+        </w:rPr>
+        <w:fldChar w:fldCharType="begin"/>
+        <w:instrText xml:space="preserve"> SEQ ภาพ \* ARABIC </w:instrText>
+        <w:fldChar w:fldCharType="separate"/>
+        <w:t>0</w:t>
+        <w:fldChar w:fldCharType="end"/>
+      </w:r>
+      <w:r>
+        <w:rPr>
+          <w:rFonts w:ascii="TH Sarabun New" w:hAnsi="TH Sarabun New"/>
+          <w:b w:val="0"/>
+          <w:sz w:val="28"/>
+        </w:rPr>
+        <w:t xml:space="preserve">  โครงหน้าจอ (Wireframe) ของหน้าเว็บแสดงผลการตรวจ</w:t>
+      </w:r>
+    </w:p>
+    <w:p>
+      <w:pPr>
         <w:pStyle w:val="Heading2"/>
         <w:spacing w:before="240" w:after="120"/>
       </w:pPr>
@@ -8432,7 +8616,7 @@
         <w:drawing>
           <wp:inline xmlns:a="http://schemas.openxmlformats.org/drawingml/2006/main" xmlns:pic="http://schemas.openxmlformats.org/drawingml/2006/picture">
             <wp:extent cx="5852160" cy="5252950"/>
-            <wp:docPr id="16" name="Picture 16"/>
+            <wp:docPr id="18" name="Picture 18"/>
             <wp:cNvGraphicFramePr>
               <a:graphicFrameLocks noChangeAspect="1"/>
             </wp:cNvGraphicFramePr>
@@ -8444,7 +8628,7 @@
                     <pic:cNvPicPr/>
                   </pic:nvPicPr>
                   <pic:blipFill>
-                    <a:blip r:embed="rId24"/>
+                    <a:blip r:embed="rId26"/>
                     <a:stretch>
                       <a:fillRect/>
                     </a:stretch>
@@ -11418,7 +11602,7 @@
       </w:r>
     </w:p>
     <w:sectPr>
-      <w:footerReference w:type="default" r:id="rId25"/>
+      <w:footerReference w:type="default" r:id="rId27"/>
       <w:pgSz w:w="12240" w:h="15840"/>
       <w:pgMar w:top="1417" w:right="1134" w:bottom="1417" w:left="1701" w:header="720" w:footer="720" w:gutter="0"/>
       <w:cols w:space="720"/>

</xml_diff>

<commit_message>
thesis doc: add real result/UI screenshots (24 figures now)
- ch2 §5: sample detection result (rust on rebar)
- ch3 §6.9: 3 per-class result examples (crazing/scratches/rust) + grayscale
  vs domain-adapted model comparison on a real photo
- de-hardcode remaining "ภาพ N" prose refs so figure numbers auto-flow

Still template-only (external / needs manual capture): screenshots of the
third-party systems reviewed in ch2 §14, and multi-screen dashboards that
belong to Future Work.

Co-Authored-By: Claude Sonnet 5 <noreply@anthropic.com>
Claude-Session: https://claude.ai/code/session_018gchiU5j53bcZCXo2Ma7ui
</commit_message>
<xml_diff>
--- a/docs/ภาคนิพนธ์_ระบบตรวจจับตำหนิผิวเหล็ก_บท1-3.docx
+++ b/docs/ภาคนิพนธ์_ระบบตรวจจับตำหนิผิวเหล็ก_บท1-3.docx
@@ -2238,7 +2238,81 @@
         <w:ind w:firstLine="720"/>
       </w:pPr>
       <w:r>
-        <w:t>YOLO เป็นสถาปัตยกรรมตรวจจับวัตถุที่ทำนายกรอบและคลาสในครั้งเดียว จึงเร็วและเหมาะกับงานตรวจสอบ โครงงานนี้ใช้ YOLO11 รุ่นเล็ก (yolo11n) ซึ่งมีพารามิเตอร์น้อย เหมาะกับเครื่องที่มีทรัพยากรจำกัด และได้ผลใกล้เคียงรุ่นใหญ่กว่าในโดเมนนี้</w:t>
+        <w:t>YOLO เป็นสถาปัตยกรรมตรวจจับวัตถุที่ทำนายกรอบและคลาสในครั้งเดียว จึงเร็วและเหมาะกับงานตรวจสอบ โครงงานนี้ใช้ YOLO11 รุ่นเล็ก (yolo11n) ซึ่งมีพารามิเตอร์น้อย เหมาะกับเครื่องที่มีทรัพยากรจำกัด และได้ผลใกล้เคียงรุ่นใหญ่กว่าในโดเมนนี้ ตัวอย่างผลการตรวจจับของระบบแสดงในภาพ 2</w:t>
+      </w:r>
+    </w:p>
+    <w:p>
+      <w:pPr>
+        <w:spacing w:before="120"/>
+        <w:jc w:val="center"/>
+      </w:pPr>
+      <w:r>
+        <w:drawing>
+          <wp:inline xmlns:a="http://schemas.openxmlformats.org/drawingml/2006/main" xmlns:pic="http://schemas.openxmlformats.org/drawingml/2006/picture">
+            <wp:extent cx="4206240" cy="7495895"/>
+            <wp:docPr id="2" name="Picture 2"/>
+            <wp:cNvGraphicFramePr>
+              <a:graphicFrameLocks noChangeAspect="1"/>
+            </wp:cNvGraphicFramePr>
+            <a:graphic>
+              <a:graphicData uri="http://schemas.openxmlformats.org/drawingml/2006/picture">
+                <pic:pic>
+                  <pic:nvPicPr>
+                    <pic:cNvPr id="0" name="res_rust.jpg"/>
+                    <pic:cNvPicPr/>
+                  </pic:nvPicPr>
+                  <pic:blipFill>
+                    <a:blip r:embed="rId10"/>
+                    <a:stretch>
+                      <a:fillRect/>
+                    </a:stretch>
+                  </pic:blipFill>
+                  <pic:spPr>
+                    <a:xfrm>
+                      <a:off x="0" y="0"/>
+                      <a:ext cx="4206240" cy="7495895"/>
+                    </a:xfrm>
+                    <a:prstGeom prst="rect"/>
+                  </pic:spPr>
+                </pic:pic>
+              </a:graphicData>
+            </a:graphic>
+          </wp:inline>
+        </w:drawing>
+      </w:r>
+    </w:p>
+    <w:p>
+      <w:pPr>
+        <w:spacing w:after="240" w:before="0"/>
+        <w:jc w:val="center"/>
+      </w:pPr>
+      <w:r>
+        <w:rPr>
+          <w:rFonts w:ascii="TH Sarabun New" w:hAnsi="TH Sarabun New"/>
+          <w:b w:val="0"/>
+          <w:sz w:val="28"/>
+        </w:rPr>
+        <w:t xml:space="preserve">ภาพ </w:t>
+      </w:r>
+      <w:r>
+        <w:rPr>
+          <w:rFonts w:ascii="TH Sarabun New" w:hAnsi="TH Sarabun New"/>
+          <w:b w:val="0"/>
+          <w:sz w:val="28"/>
+        </w:rPr>
+        <w:fldChar w:fldCharType="begin"/>
+        <w:instrText xml:space="preserve"> SEQ ภาพ \* ARABIC </w:instrText>
+        <w:fldChar w:fldCharType="separate"/>
+        <w:t>0</w:t>
+        <w:fldChar w:fldCharType="end"/>
+      </w:r>
+      <w:r>
+        <w:rPr>
+          <w:rFonts w:ascii="TH Sarabun New" w:hAnsi="TH Sarabun New"/>
+          <w:b w:val="0"/>
+          <w:sz w:val="28"/>
+        </w:rPr>
+        <w:t xml:space="preserve">  ตัวอย่างผลการตรวจจับตำหนิของระบบ — สนิม (rust) บนเหล็กเส้น พร้อมกรอบ ป้ายชนิดภาษาไทย และค่าความมั่นใจ</w:t>
       </w:r>
     </w:p>
     <w:p>
@@ -3423,7 +3497,7 @@
         <w:ind w:firstLine="720"/>
       </w:pPr>
       <w:r>
-        <w:t>ขั้นตอนการเตรียมข้อมูลตั้งแต่ภาพดิบจนถึงพร้อมฝึก แสดงในภาพ 2</w:t>
+        <w:t>ขั้นตอนการเตรียมข้อมูลตั้งแต่ภาพดิบจนถึงพร้อมฝึก แสดงในภาพต่อไปนี้</w:t>
       </w:r>
     </w:p>
     <w:p>
@@ -3435,7 +3509,7 @@
         <w:drawing>
           <wp:inline xmlns:a="http://schemas.openxmlformats.org/drawingml/2006/main" xmlns:pic="http://schemas.openxmlformats.org/drawingml/2006/picture">
             <wp:extent cx="5760720" cy="5187335"/>
-            <wp:docPr id="2" name="Picture 2"/>
+            <wp:docPr id="3" name="Picture 3"/>
             <wp:cNvGraphicFramePr>
               <a:graphicFrameLocks noChangeAspect="1"/>
             </wp:cNvGraphicFramePr>
@@ -3447,7 +3521,7 @@
                     <pic:cNvPicPr/>
                   </pic:nvPicPr>
                   <pic:blipFill>
-                    <a:blip r:embed="rId10"/>
+                    <a:blip r:embed="rId11"/>
                     <a:stretch>
                       <a:fillRect/>
                     </a:stretch>
@@ -3584,7 +3658,7 @@
         <w:ind w:firstLine="720"/>
       </w:pPr>
       <w:r>
-        <w:t>การกระจายของจำนวนตัวอย่างในแต่ละคลาสแสดงในภาพ 3 ซึ่งชี้ให้เห็นความไม่สมดุลของคลาส (Class Imbalance) ที่ต้องแก้ด้วยการ oversampling</w:t>
+        <w:t>การกระจายของจำนวนตัวอย่างในแต่ละคลาสแสดงในภาพต่อไปนี้ ซึ่งชี้ให้เห็นความไม่สมดุลของคลาส (Class Imbalance) ที่ต้องแก้ด้วยการ oversampling</w:t>
       </w:r>
     </w:p>
     <w:p>
@@ -3596,7 +3670,7 @@
         <w:drawing>
           <wp:inline xmlns:a="http://schemas.openxmlformats.org/drawingml/2006/main" xmlns:pic="http://schemas.openxmlformats.org/drawingml/2006/picture">
             <wp:extent cx="5486400" cy="2428668"/>
-            <wp:docPr id="3" name="Picture 3"/>
+            <wp:docPr id="4" name="Picture 4"/>
             <wp:cNvGraphicFramePr>
               <a:graphicFrameLocks noChangeAspect="1"/>
             </wp:cNvGraphicFramePr>
@@ -3608,7 +3682,7 @@
                     <pic:cNvPicPr/>
                   </pic:nvPicPr>
                   <pic:blipFill>
-                    <a:blip r:embed="rId11"/>
+                    <a:blip r:embed="rId12"/>
                     <a:stretch>
                       <a:fillRect/>
                     </a:stretch>
@@ -6098,7 +6172,7 @@
         <w:ind w:firstLine="720"/>
       </w:pPr>
       <w:r>
-        <w:t>ระบบมีอินเทอร์เฟซ 2 ทาง คือ หน้าเว็บ (Gradio, app.py) และคำสั่งบรรทัด (CLI, pipeline.py) ซึ่งทั้งคู่เรียกใช้แกนประมวลผลเดียวกัน โครงสร้างโดยรวมแสดงในภาพ 4 และรายละเอียดภายในแต่ละขั้น ในภาพ 5 และภาพ 6</w:t>
+        <w:t>ระบบมีอินเทอร์เฟซ 2 ทาง คือ หน้าเว็บ (Gradio, app.py) และคำสั่งบรรทัด (CLI, pipeline.py) ซึ่งทั้งคู่เรียกใช้แกนประมวลผลเดียวกัน โครงสร้างโดยรวมและรายละเอียดภายในแต่ละขั้นแสดงในภาพต่อไปนี้</w:t>
       </w:r>
     </w:p>
     <w:p>
@@ -6110,7 +6184,7 @@
         <w:drawing>
           <wp:inline xmlns:a="http://schemas.openxmlformats.org/drawingml/2006/main" xmlns:pic="http://schemas.openxmlformats.org/drawingml/2006/picture">
             <wp:extent cx="5120640" cy="5933370"/>
-            <wp:docPr id="4" name="Picture 4"/>
+            <wp:docPr id="5" name="Picture 5"/>
             <wp:cNvGraphicFramePr>
               <a:graphicFrameLocks noChangeAspect="1"/>
             </wp:cNvGraphicFramePr>
@@ -6122,7 +6196,7 @@
                     <pic:cNvPicPr/>
                   </pic:nvPicPr>
                   <pic:blipFill>
-                    <a:blip r:embed="rId12"/>
+                    <a:blip r:embed="rId13"/>
                     <a:stretch>
                       <a:fillRect/>
                     </a:stretch>
@@ -6340,7 +6414,7 @@
         <w:drawing>
           <wp:inline xmlns:a="http://schemas.openxmlformats.org/drawingml/2006/main" xmlns:pic="http://schemas.openxmlformats.org/drawingml/2006/picture">
             <wp:extent cx="5760720" cy="7529407"/>
-            <wp:docPr id="5" name="Picture 5"/>
+            <wp:docPr id="6" name="Picture 6"/>
             <wp:cNvGraphicFramePr>
               <a:graphicFrameLocks noChangeAspect="1"/>
             </wp:cNvGraphicFramePr>
@@ -6352,7 +6426,7 @@
                     <pic:cNvPicPr/>
                   </pic:nvPicPr>
                   <pic:blipFill>
-                    <a:blip r:embed="rId13"/>
+                    <a:blip r:embed="rId14"/>
                     <a:stretch>
                       <a:fillRect/>
                     </a:stretch>
@@ -6414,7 +6488,7 @@
         <w:drawing>
           <wp:inline xmlns:a="http://schemas.openxmlformats.org/drawingml/2006/main" xmlns:pic="http://schemas.openxmlformats.org/drawingml/2006/picture">
             <wp:extent cx="5760720" cy="6675041"/>
-            <wp:docPr id="6" name="Picture 6"/>
+            <wp:docPr id="7" name="Picture 7"/>
             <wp:cNvGraphicFramePr>
               <a:graphicFrameLocks noChangeAspect="1"/>
             </wp:cNvGraphicFramePr>
@@ -6426,7 +6500,7 @@
                     <pic:cNvPicPr/>
                   </pic:nvPicPr>
                   <pic:blipFill>
-                    <a:blip r:embed="rId14"/>
+                    <a:blip r:embed="rId15"/>
                     <a:stretch>
                       <a:fillRect/>
                     </a:stretch>
@@ -6497,7 +6571,7 @@
         <w:drawing>
           <wp:inline xmlns:a="http://schemas.openxmlformats.org/drawingml/2006/main" xmlns:pic="http://schemas.openxmlformats.org/drawingml/2006/picture">
             <wp:extent cx="5669280" cy="3871174"/>
-            <wp:docPr id="7" name="Picture 7"/>
+            <wp:docPr id="8" name="Picture 8"/>
             <wp:cNvGraphicFramePr>
               <a:graphicFrameLocks noChangeAspect="1"/>
             </wp:cNvGraphicFramePr>
@@ -6509,7 +6583,7 @@
                     <pic:cNvPicPr/>
                   </pic:nvPicPr>
                   <pic:blipFill>
-                    <a:blip r:embed="rId15"/>
+                    <a:blip r:embed="rId16"/>
                     <a:stretch>
                       <a:fillRect/>
                     </a:stretch>
@@ -6571,7 +6645,7 @@
         <w:drawing>
           <wp:inline xmlns:a="http://schemas.openxmlformats.org/drawingml/2006/main" xmlns:pic="http://schemas.openxmlformats.org/drawingml/2006/picture">
             <wp:extent cx="5852160" cy="4940787"/>
-            <wp:docPr id="8" name="Picture 8"/>
+            <wp:docPr id="9" name="Picture 9"/>
             <wp:cNvGraphicFramePr>
               <a:graphicFrameLocks noChangeAspect="1"/>
             </wp:cNvGraphicFramePr>
@@ -6583,7 +6657,7 @@
                     <pic:cNvPicPr/>
                   </pic:nvPicPr>
                   <pic:blipFill>
-                    <a:blip r:embed="rId16"/>
+                    <a:blip r:embed="rId17"/>
                     <a:stretch>
                       <a:fillRect/>
                     </a:stretch>
@@ -6645,7 +6719,7 @@
         <w:drawing>
           <wp:inline xmlns:a="http://schemas.openxmlformats.org/drawingml/2006/main" xmlns:pic="http://schemas.openxmlformats.org/drawingml/2006/picture">
             <wp:extent cx="5669280" cy="4583904"/>
-            <wp:docPr id="9" name="Picture 9"/>
+            <wp:docPr id="10" name="Picture 10"/>
             <wp:cNvGraphicFramePr>
               <a:graphicFrameLocks noChangeAspect="1"/>
             </wp:cNvGraphicFramePr>
@@ -6657,7 +6731,7 @@
                     <pic:cNvPicPr/>
                   </pic:nvPicPr>
                   <pic:blipFill>
-                    <a:blip r:embed="rId17"/>
+                    <a:blip r:embed="rId18"/>
                     <a:stretch>
                       <a:fillRect/>
                     </a:stretch>
@@ -6725,7 +6799,7 @@
         <w:ind w:firstLine="720"/>
       </w:pPr>
       <w:r>
-        <w:t>แผนผังลำดับขั้นตอนการทำงานของระบบหลักแสดงในภาพ 10 และขั้นตอนการปรับแต่งภาพในภาพ 11</w:t>
+        <w:t>แผนผังลำดับขั้นตอนการทำงานของระบบหลักและขั้นตอนการปรับแต่งภาพแสดงในภาพต่อไปนี้</w:t>
       </w:r>
     </w:p>
     <w:p>
@@ -6737,7 +6811,7 @@
         <w:drawing>
           <wp:inline xmlns:a="http://schemas.openxmlformats.org/drawingml/2006/main" xmlns:pic="http://schemas.openxmlformats.org/drawingml/2006/picture">
             <wp:extent cx="5120640" cy="6827520"/>
-            <wp:docPr id="10" name="Picture 10"/>
+            <wp:docPr id="11" name="Picture 11"/>
             <wp:cNvGraphicFramePr>
               <a:graphicFrameLocks noChangeAspect="1"/>
             </wp:cNvGraphicFramePr>
@@ -6749,7 +6823,7 @@
                     <pic:cNvPicPr/>
                   </pic:nvPicPr>
                   <pic:blipFill>
-                    <a:blip r:embed="rId18"/>
+                    <a:blip r:embed="rId19"/>
                     <a:stretch>
                       <a:fillRect/>
                     </a:stretch>
@@ -6811,7 +6885,7 @@
         <w:drawing>
           <wp:inline xmlns:a="http://schemas.openxmlformats.org/drawingml/2006/main" xmlns:pic="http://schemas.openxmlformats.org/drawingml/2006/picture">
             <wp:extent cx="5303520" cy="4618607"/>
-            <wp:docPr id="11" name="Picture 11"/>
+            <wp:docPr id="12" name="Picture 12"/>
             <wp:cNvGraphicFramePr>
               <a:graphicFrameLocks noChangeAspect="1"/>
             </wp:cNvGraphicFramePr>
@@ -6823,7 +6897,7 @@
                     <pic:cNvPicPr/>
                   </pic:nvPicPr>
                   <pic:blipFill>
-                    <a:blip r:embed="rId19"/>
+                    <a:blip r:embed="rId20"/>
                     <a:stretch>
                       <a:fillRect/>
                     </a:stretch>
@@ -6894,7 +6968,7 @@
         <w:drawing>
           <wp:inline xmlns:a="http://schemas.openxmlformats.org/drawingml/2006/main" xmlns:pic="http://schemas.openxmlformats.org/drawingml/2006/picture">
             <wp:extent cx="5669280" cy="4174196"/>
-            <wp:docPr id="12" name="Picture 12"/>
+            <wp:docPr id="13" name="Picture 13"/>
             <wp:cNvGraphicFramePr>
               <a:graphicFrameLocks noChangeAspect="1"/>
             </wp:cNvGraphicFramePr>
@@ -6906,7 +6980,7 @@
                     <pic:cNvPicPr/>
                   </pic:nvPicPr>
                   <pic:blipFill>
-                    <a:blip r:embed="rId20"/>
+                    <a:blip r:embed="rId21"/>
                     <a:stretch>
                       <a:fillRect/>
                     </a:stretch>
@@ -8174,7 +8248,7 @@
         <w:drawing>
           <wp:inline xmlns:a="http://schemas.openxmlformats.org/drawingml/2006/main" xmlns:pic="http://schemas.openxmlformats.org/drawingml/2006/picture">
             <wp:extent cx="5852160" cy="5569047"/>
-            <wp:docPr id="13" name="Picture 13"/>
+            <wp:docPr id="14" name="Picture 14"/>
             <wp:cNvGraphicFramePr>
               <a:graphicFrameLocks noChangeAspect="1"/>
             </wp:cNvGraphicFramePr>
@@ -8186,7 +8260,7 @@
                     <pic:cNvPicPr/>
                   </pic:nvPicPr>
                   <pic:blipFill>
-                    <a:blip r:embed="rId21"/>
+                    <a:blip r:embed="rId22"/>
                     <a:stretch>
                       <a:fillRect/>
                     </a:stretch>
@@ -8257,7 +8331,7 @@
         <w:drawing>
           <wp:inline xmlns:a="http://schemas.openxmlformats.org/drawingml/2006/main" xmlns:pic="http://schemas.openxmlformats.org/drawingml/2006/picture">
             <wp:extent cx="3657600" cy="6537266"/>
-            <wp:docPr id="14" name="Picture 14"/>
+            <wp:docPr id="15" name="Picture 15"/>
             <wp:cNvGraphicFramePr>
               <a:graphicFrameLocks noChangeAspect="1"/>
             </wp:cNvGraphicFramePr>
@@ -8269,7 +8343,7 @@
                     <pic:cNvPicPr/>
                   </pic:nvPicPr>
                   <pic:blipFill>
-                    <a:blip r:embed="rId22"/>
+                    <a:blip r:embed="rId23"/>
                     <a:stretch>
                       <a:fillRect/>
                     </a:stretch>
@@ -8331,7 +8405,7 @@
         <w:drawing>
           <wp:inline xmlns:a="http://schemas.openxmlformats.org/drawingml/2006/main" xmlns:pic="http://schemas.openxmlformats.org/drawingml/2006/picture">
             <wp:extent cx="5760720" cy="2492513"/>
-            <wp:docPr id="15" name="Picture 15"/>
+            <wp:docPr id="16" name="Picture 16"/>
             <wp:cNvGraphicFramePr>
               <a:graphicFrameLocks noChangeAspect="1"/>
             </wp:cNvGraphicFramePr>
@@ -8343,7 +8417,7 @@
                     <pic:cNvPicPr/>
                   </pic:nvPicPr>
                   <pic:blipFill>
-                    <a:blip r:embed="rId23"/>
+                    <a:blip r:embed="rId24"/>
                     <a:stretch>
                       <a:fillRect/>
                     </a:stretch>
@@ -8423,7 +8497,7 @@
         <w:drawing>
           <wp:inline xmlns:a="http://schemas.openxmlformats.org/drawingml/2006/main" xmlns:pic="http://schemas.openxmlformats.org/drawingml/2006/picture">
             <wp:extent cx="5486400" cy="7478590"/>
-            <wp:docPr id="16" name="Picture 16"/>
+            <wp:docPr id="17" name="Picture 17"/>
             <wp:cNvGraphicFramePr>
               <a:graphicFrameLocks noChangeAspect="1"/>
             </wp:cNvGraphicFramePr>
@@ -8435,7 +8509,7 @@
                     <pic:cNvPicPr/>
                   </pic:nvPicPr>
                   <pic:blipFill>
-                    <a:blip r:embed="rId24"/>
+                    <a:blip r:embed="rId25"/>
                     <a:stretch>
                       <a:fillRect/>
                     </a:stretch>
@@ -8515,7 +8589,7 @@
         <w:drawing>
           <wp:inline xmlns:a="http://schemas.openxmlformats.org/drawingml/2006/main" xmlns:pic="http://schemas.openxmlformats.org/drawingml/2006/picture">
             <wp:extent cx="5669280" cy="4132783"/>
-            <wp:docPr id="17" name="Picture 17"/>
+            <wp:docPr id="18" name="Picture 18"/>
             <wp:cNvGraphicFramePr>
               <a:graphicFrameLocks noChangeAspect="1"/>
             </wp:cNvGraphicFramePr>
@@ -8527,7 +8601,7 @@
                     <pic:cNvPicPr/>
                   </pic:nvPicPr>
                   <pic:blipFill>
-                    <a:blip r:embed="rId25"/>
+                    <a:blip r:embed="rId26"/>
                     <a:stretch>
                       <a:fillRect/>
                     </a:stretch>
@@ -8582,6 +8656,394 @@
     </w:p>
     <w:p>
       <w:pPr>
+        <w:spacing w:after="120" w:line="276" w:lineRule="auto"/>
+        <w:ind w:firstLine="720"/>
+      </w:pPr>
+      <w:r>
+        <w:t>ตัวอย่างผลการตรวจจริงของระบบต้นแบบกับตำหนิแต่ละชนิด แสดงในภาพต่อไปนี้ โดยระบบวาดกรอบตำหนิ ป้ายชนิดภาษาไทย และค่าความมั่นใจกำกับ</w:t>
+      </w:r>
+    </w:p>
+    <w:p>
+      <w:pPr>
+        <w:spacing w:before="120"/>
+        <w:jc w:val="center"/>
+      </w:pPr>
+      <w:r>
+        <w:drawing>
+          <wp:inline xmlns:a="http://schemas.openxmlformats.org/drawingml/2006/main" xmlns:pic="http://schemas.openxmlformats.org/drawingml/2006/picture">
+            <wp:extent cx="4023360" cy="4023360"/>
+            <wp:docPr id="19" name="Picture 19"/>
+            <wp:cNvGraphicFramePr>
+              <a:graphicFrameLocks noChangeAspect="1"/>
+            </wp:cNvGraphicFramePr>
+            <a:graphic>
+              <a:graphicData uri="http://schemas.openxmlformats.org/drawingml/2006/picture">
+                <pic:pic>
+                  <pic:nvPicPr>
+                    <pic:cNvPr id="0" name="res_crazing.jpg"/>
+                    <pic:cNvPicPr/>
+                  </pic:nvPicPr>
+                  <pic:blipFill>
+                    <a:blip r:embed="rId27"/>
+                    <a:stretch>
+                      <a:fillRect/>
+                    </a:stretch>
+                  </pic:blipFill>
+                  <pic:spPr>
+                    <a:xfrm>
+                      <a:off x="0" y="0"/>
+                      <a:ext cx="4023360" cy="4023360"/>
+                    </a:xfrm>
+                    <a:prstGeom prst="rect"/>
+                  </pic:spPr>
+                </pic:pic>
+              </a:graphicData>
+            </a:graphic>
+          </wp:inline>
+        </w:drawing>
+      </w:r>
+    </w:p>
+    <w:p>
+      <w:pPr>
+        <w:spacing w:after="240" w:before="0"/>
+        <w:jc w:val="center"/>
+      </w:pPr>
+      <w:r>
+        <w:rPr>
+          <w:rFonts w:ascii="TH Sarabun New" w:hAnsi="TH Sarabun New"/>
+          <w:b w:val="0"/>
+          <w:sz w:val="28"/>
+        </w:rPr>
+        <w:t xml:space="preserve">ภาพ </w:t>
+      </w:r>
+      <w:r>
+        <w:rPr>
+          <w:rFonts w:ascii="TH Sarabun New" w:hAnsi="TH Sarabun New"/>
+          <w:b w:val="0"/>
+          <w:sz w:val="28"/>
+        </w:rPr>
+        <w:fldChar w:fldCharType="begin"/>
+        <w:instrText xml:space="preserve"> SEQ ภาพ \* ARABIC </w:instrText>
+        <w:fldChar w:fldCharType="separate"/>
+        <w:t>0</w:t>
+        <w:fldChar w:fldCharType="end"/>
+      </w:r>
+      <w:r>
+        <w:rPr>
+          <w:rFonts w:ascii="TH Sarabun New" w:hAnsi="TH Sarabun New"/>
+          <w:b w:val="0"/>
+          <w:sz w:val="28"/>
+        </w:rPr>
+        <w:t xml:space="preserve">  ตัวอย่างผลการตรวจ — รอยแตกลายงา (crazing) บนภาพจากชุด benchmark</w:t>
+      </w:r>
+    </w:p>
+    <w:p>
+      <w:pPr>
+        <w:spacing w:before="120"/>
+        <w:jc w:val="center"/>
+      </w:pPr>
+      <w:r>
+        <w:drawing>
+          <wp:inline xmlns:a="http://schemas.openxmlformats.org/drawingml/2006/main" xmlns:pic="http://schemas.openxmlformats.org/drawingml/2006/picture">
+            <wp:extent cx="4023360" cy="4023360"/>
+            <wp:docPr id="20" name="Picture 20"/>
+            <wp:cNvGraphicFramePr>
+              <a:graphicFrameLocks noChangeAspect="1"/>
+            </wp:cNvGraphicFramePr>
+            <a:graphic>
+              <a:graphicData uri="http://schemas.openxmlformats.org/drawingml/2006/picture">
+                <pic:pic>
+                  <pic:nvPicPr>
+                    <pic:cNvPr id="0" name="res_scratches.jpg"/>
+                    <pic:cNvPicPr/>
+                  </pic:nvPicPr>
+                  <pic:blipFill>
+                    <a:blip r:embed="rId28"/>
+                    <a:stretch>
+                      <a:fillRect/>
+                    </a:stretch>
+                  </pic:blipFill>
+                  <pic:spPr>
+                    <a:xfrm>
+                      <a:off x="0" y="0"/>
+                      <a:ext cx="4023360" cy="4023360"/>
+                    </a:xfrm>
+                    <a:prstGeom prst="rect"/>
+                  </pic:spPr>
+                </pic:pic>
+              </a:graphicData>
+            </a:graphic>
+          </wp:inline>
+        </w:drawing>
+      </w:r>
+    </w:p>
+    <w:p>
+      <w:pPr>
+        <w:spacing w:after="240" w:before="0"/>
+        <w:jc w:val="center"/>
+      </w:pPr>
+      <w:r>
+        <w:rPr>
+          <w:rFonts w:ascii="TH Sarabun New" w:hAnsi="TH Sarabun New"/>
+          <w:b w:val="0"/>
+          <w:sz w:val="28"/>
+        </w:rPr>
+        <w:t xml:space="preserve">ภาพ </w:t>
+      </w:r>
+      <w:r>
+        <w:rPr>
+          <w:rFonts w:ascii="TH Sarabun New" w:hAnsi="TH Sarabun New"/>
+          <w:b w:val="0"/>
+          <w:sz w:val="28"/>
+        </w:rPr>
+        <w:fldChar w:fldCharType="begin"/>
+        <w:instrText xml:space="preserve"> SEQ ภาพ \* ARABIC </w:instrText>
+        <w:fldChar w:fldCharType="separate"/>
+        <w:t>0</w:t>
+        <w:fldChar w:fldCharType="end"/>
+      </w:r>
+      <w:r>
+        <w:rPr>
+          <w:rFonts w:ascii="TH Sarabun New" w:hAnsi="TH Sarabun New"/>
+          <w:b w:val="0"/>
+          <w:sz w:val="28"/>
+        </w:rPr>
+        <w:t xml:space="preserve">  ตัวอย่างผลการตรวจ — รอยขีดข่วน (scratches)</w:t>
+      </w:r>
+    </w:p>
+    <w:p>
+      <w:pPr>
+        <w:spacing w:before="120"/>
+        <w:jc w:val="center"/>
+      </w:pPr>
+      <w:r>
+        <w:drawing>
+          <wp:inline xmlns:a="http://schemas.openxmlformats.org/drawingml/2006/main" xmlns:pic="http://schemas.openxmlformats.org/drawingml/2006/picture">
+            <wp:extent cx="4206240" cy="7495895"/>
+            <wp:docPr id="21" name="Picture 21"/>
+            <wp:cNvGraphicFramePr>
+              <a:graphicFrameLocks noChangeAspect="1"/>
+            </wp:cNvGraphicFramePr>
+            <a:graphic>
+              <a:graphicData uri="http://schemas.openxmlformats.org/drawingml/2006/picture">
+                <pic:pic>
+                  <pic:nvPicPr>
+                    <pic:cNvPr id="0" name="res_rust.jpg"/>
+                    <pic:cNvPicPr/>
+                  </pic:nvPicPr>
+                  <pic:blipFill>
+                    <a:blip r:embed="rId10"/>
+                    <a:stretch>
+                      <a:fillRect/>
+                    </a:stretch>
+                  </pic:blipFill>
+                  <pic:spPr>
+                    <a:xfrm>
+                      <a:off x="0" y="0"/>
+                      <a:ext cx="4206240" cy="7495895"/>
+                    </a:xfrm>
+                    <a:prstGeom prst="rect"/>
+                  </pic:spPr>
+                </pic:pic>
+              </a:graphicData>
+            </a:graphic>
+          </wp:inline>
+        </w:drawing>
+      </w:r>
+    </w:p>
+    <w:p>
+      <w:pPr>
+        <w:spacing w:after="240" w:before="0"/>
+        <w:jc w:val="center"/>
+      </w:pPr>
+      <w:r>
+        <w:rPr>
+          <w:rFonts w:ascii="TH Sarabun New" w:hAnsi="TH Sarabun New"/>
+          <w:b w:val="0"/>
+          <w:sz w:val="28"/>
+        </w:rPr>
+        <w:t xml:space="preserve">ภาพ </w:t>
+      </w:r>
+      <w:r>
+        <w:rPr>
+          <w:rFonts w:ascii="TH Sarabun New" w:hAnsi="TH Sarabun New"/>
+          <w:b w:val="0"/>
+          <w:sz w:val="28"/>
+        </w:rPr>
+        <w:fldChar w:fldCharType="begin"/>
+        <w:instrText xml:space="preserve"> SEQ ภาพ \* ARABIC </w:instrText>
+        <w:fldChar w:fldCharType="separate"/>
+        <w:t>0</w:t>
+        <w:fldChar w:fldCharType="end"/>
+      </w:r>
+      <w:r>
+        <w:rPr>
+          <w:rFonts w:ascii="TH Sarabun New" w:hAnsi="TH Sarabun New"/>
+          <w:b w:val="0"/>
+          <w:sz w:val="28"/>
+        </w:rPr>
+        <w:t xml:space="preserve">  ตัวอย่างผลการตรวจ — สนิม (rust) บนภาพถ่ายเหล็กเส้นระดับสถานที่</w:t>
+      </w:r>
+    </w:p>
+    <w:p>
+      <w:pPr>
+        <w:spacing w:after="120" w:line="276" w:lineRule="auto"/>
+        <w:ind w:firstLine="720"/>
+      </w:pPr>
+      <w:r>
+        <w:t>ภาพต่อไปนี้เปรียบเทียบผลของแบบจำลองสองแบบบนภาพถ่ายจริงภาพเดียวกัน — แบบจำลองที่รายงานผลในเล่ม (ฝึกบน grayscale) กับแบบจำลองที่เพิ่มภาพถ่ายจริงเข้าไปในการฝึก (งานพัฒนาต่อ) เพื่อแสดงช่องว่าง เชิงโดเมน</w:t>
+      </w:r>
+    </w:p>
+    <w:p>
+      <w:pPr>
+        <w:spacing w:before="120"/>
+        <w:jc w:val="center"/>
+      </w:pPr>
+      <w:r>
+        <w:drawing>
+          <wp:inline xmlns:a="http://schemas.openxmlformats.org/drawingml/2006/main" xmlns:pic="http://schemas.openxmlformats.org/drawingml/2006/picture">
+            <wp:extent cx="4206240" cy="7495895"/>
+            <wp:docPr id="22" name="Picture 22"/>
+            <wp:cNvGraphicFramePr>
+              <a:graphicFrameLocks noChangeAspect="1"/>
+            </wp:cNvGraphicFramePr>
+            <a:graphic>
+              <a:graphicData uri="http://schemas.openxmlformats.org/drawingml/2006/picture">
+                <pic:pic>
+                  <pic:nvPicPr>
+                    <pic:cNvPr id="0" name="res_thesis_model.jpg"/>
+                    <pic:cNvPicPr/>
+                  </pic:nvPicPr>
+                  <pic:blipFill>
+                    <a:blip r:embed="rId29"/>
+                    <a:stretch>
+                      <a:fillRect/>
+                    </a:stretch>
+                  </pic:blipFill>
+                  <pic:spPr>
+                    <a:xfrm>
+                      <a:off x="0" y="0"/>
+                      <a:ext cx="4206240" cy="7495895"/>
+                    </a:xfrm>
+                    <a:prstGeom prst="rect"/>
+                  </pic:spPr>
+                </pic:pic>
+              </a:graphicData>
+            </a:graphic>
+          </wp:inline>
+        </w:drawing>
+      </w:r>
+    </w:p>
+    <w:p>
+      <w:pPr>
+        <w:spacing w:after="240" w:before="0"/>
+        <w:jc w:val="center"/>
+      </w:pPr>
+      <w:r>
+        <w:rPr>
+          <w:rFonts w:ascii="TH Sarabun New" w:hAnsi="TH Sarabun New"/>
+          <w:b w:val="0"/>
+          <w:sz w:val="28"/>
+        </w:rPr>
+        <w:t xml:space="preserve">ภาพ </w:t>
+      </w:r>
+      <w:r>
+        <w:rPr>
+          <w:rFonts w:ascii="TH Sarabun New" w:hAnsi="TH Sarabun New"/>
+          <w:b w:val="0"/>
+          <w:sz w:val="28"/>
+        </w:rPr>
+        <w:fldChar w:fldCharType="begin"/>
+        <w:instrText xml:space="preserve"> SEQ ภาพ \* ARABIC </w:instrText>
+        <w:fldChar w:fldCharType="separate"/>
+        <w:t>0</w:t>
+        <w:fldChar w:fldCharType="end"/>
+      </w:r>
+      <w:r>
+        <w:rPr>
+          <w:rFonts w:ascii="TH Sarabun New" w:hAnsi="TH Sarabun New"/>
+          <w:b w:val="0"/>
+          <w:sz w:val="28"/>
+        </w:rPr>
+        <w:t xml:space="preserve">  ผลบนภาพถ่ายจริง — แบบจำลองที่ฝึกบน grayscale (ไม่พบตำหนิ)</w:t>
+      </w:r>
+    </w:p>
+    <w:p>
+      <w:pPr>
+        <w:spacing w:before="120"/>
+        <w:jc w:val="center"/>
+      </w:pPr>
+      <w:r>
+        <w:drawing>
+          <wp:inline xmlns:a="http://schemas.openxmlformats.org/drawingml/2006/main" xmlns:pic="http://schemas.openxmlformats.org/drawingml/2006/picture">
+            <wp:extent cx="4206240" cy="7495895"/>
+            <wp:docPr id="23" name="Picture 23"/>
+            <wp:cNvGraphicFramePr>
+              <a:graphicFrameLocks noChangeAspect="1"/>
+            </wp:cNvGraphicFramePr>
+            <a:graphic>
+              <a:graphicData uri="http://schemas.openxmlformats.org/drawingml/2006/picture">
+                <pic:pic>
+                  <pic:nvPicPr>
+                    <pic:cNvPr id="0" name="res_adapted_model.jpg"/>
+                    <pic:cNvPicPr/>
+                  </pic:nvPicPr>
+                  <pic:blipFill>
+                    <a:blip r:embed="rId30"/>
+                    <a:stretch>
+                      <a:fillRect/>
+                    </a:stretch>
+                  </pic:blipFill>
+                  <pic:spPr>
+                    <a:xfrm>
+                      <a:off x="0" y="0"/>
+                      <a:ext cx="4206240" cy="7495895"/>
+                    </a:xfrm>
+                    <a:prstGeom prst="rect"/>
+                  </pic:spPr>
+                </pic:pic>
+              </a:graphicData>
+            </a:graphic>
+          </wp:inline>
+        </w:drawing>
+      </w:r>
+    </w:p>
+    <w:p>
+      <w:pPr>
+        <w:spacing w:after="240" w:before="0"/>
+        <w:jc w:val="center"/>
+      </w:pPr>
+      <w:r>
+        <w:rPr>
+          <w:rFonts w:ascii="TH Sarabun New" w:hAnsi="TH Sarabun New"/>
+          <w:b w:val="0"/>
+          <w:sz w:val="28"/>
+        </w:rPr>
+        <w:t xml:space="preserve">ภาพ </w:t>
+      </w:r>
+      <w:r>
+        <w:rPr>
+          <w:rFonts w:ascii="TH Sarabun New" w:hAnsi="TH Sarabun New"/>
+          <w:b w:val="0"/>
+          <w:sz w:val="28"/>
+        </w:rPr>
+        <w:fldChar w:fldCharType="begin"/>
+        <w:instrText xml:space="preserve"> SEQ ภาพ \* ARABIC </w:instrText>
+        <w:fldChar w:fldCharType="separate"/>
+        <w:t>0</w:t>
+        <w:fldChar w:fldCharType="end"/>
+      </w:r>
+      <w:r>
+        <w:rPr>
+          <w:rFonts w:ascii="TH Sarabun New" w:hAnsi="TH Sarabun New"/>
+          <w:b w:val="0"/>
+          <w:sz w:val="28"/>
+        </w:rPr>
+        <w:t xml:space="preserve">  ผลบนภาพถ่ายจริง — แบบจำลองที่เพิ่มภาพถ่ายจริงในการฝึก (ตรวจพบสนิม)</w:t>
+      </w:r>
+    </w:p>
+    <w:p>
+      <w:pPr>
         <w:pStyle w:val="Heading2"/>
         <w:spacing w:before="240" w:after="120"/>
       </w:pPr>
@@ -8616,7 +9078,7 @@
         <w:drawing>
           <wp:inline xmlns:a="http://schemas.openxmlformats.org/drawingml/2006/main" xmlns:pic="http://schemas.openxmlformats.org/drawingml/2006/picture">
             <wp:extent cx="5852160" cy="5252950"/>
-            <wp:docPr id="18" name="Picture 18"/>
+            <wp:docPr id="24" name="Picture 24"/>
             <wp:cNvGraphicFramePr>
               <a:graphicFrameLocks noChangeAspect="1"/>
             </wp:cNvGraphicFramePr>
@@ -8628,7 +9090,7 @@
                     <pic:cNvPicPr/>
                   </pic:nvPicPr>
                   <pic:blipFill>
-                    <a:blip r:embed="rId26"/>
+                    <a:blip r:embed="rId31"/>
                     <a:stretch>
                       <a:fillRect/>
                     </a:stretch>
@@ -11602,7 +12064,7 @@
       </w:r>
     </w:p>
     <w:sectPr>
-      <w:footerReference w:type="default" r:id="rId27"/>
+      <w:footerReference w:type="default" r:id="rId32"/>
       <w:pgSz w:w="12240" w:h="15840"/>
       <w:pgMar w:top="1417" w:right="1134" w:bottom="1417" w:left="1701" w:header="720" w:footer="720" w:gutter="0"/>
       <w:cols w:space="720"/>

</xml_diff>

<commit_message>
thesis doc: clearer example images + fresh high-res wireframe
- gen_result_figs(): re-render the ตัวอย่างผลการตรวจ images by upscaling the
  source to ~1400 px first, so boxes/labels are crisp in print. New set:
  crazing / scratches / patches / rust (rebar) / rust (pipe) + the two-model
  comparison pair, all regenerated.
- fig_wireframe(): new grayscale wireframe drawn to match the current app
  layout (single gallery, gr.Dataframe, full-width result + Stage 1),
  large and legible; replaces the small make_design_doc one in §6.9.
- figure DPI 175 -> 200; result figures widened to 5.0-6.6 in.
- app.py: label placement — when a box hugs the top edge (or is full-frame),
  draw the label inside the box, inset a few px, instead of clipping it at
  the corner. Benefits both the demo and these figures.

26 figures / 15 tables. test_smoke.py passes.

Co-Authored-By: Claude Sonnet 5 <noreply@anthropic.com>
Claude-Session: https://claude.ai/code/session_018gchiU5j53bcZCXo2Ma7ui
</commit_message>
<xml_diff>
--- a/docs/ภาคนิพนธ์_ระบบตรวจจับตำหนิผิวเหล็ก_บท1-3.docx
+++ b/docs/ภาคนิพนธ์_ระบบตรวจจับตำหนิผิวเหล็ก_บท1-3.docx
@@ -708,7 +708,7 @@
       <w:r>
         <w:drawing>
           <wp:inline xmlns:a="http://schemas.openxmlformats.org/drawingml/2006/main" xmlns:pic="http://schemas.openxmlformats.org/drawingml/2006/picture">
-            <wp:extent cx="4754880" cy="4598616"/>
+            <wp:extent cx="4754880" cy="4594822"/>
             <wp:docPr id="1" name="Picture 1"/>
             <wp:cNvGraphicFramePr>
               <a:graphicFrameLocks noChangeAspect="1"/>
@@ -729,7 +729,7 @@
                   <pic:spPr>
                     <a:xfrm>
                       <a:off x="0" y="0"/>
-                      <a:ext cx="4754880" cy="4598616"/>
+                      <a:ext cx="4754880" cy="4594822"/>
                     </a:xfrm>
                     <a:prstGeom prst="rect"/>
                   </pic:spPr>
@@ -2249,7 +2249,7 @@
       <w:r>
         <w:drawing>
           <wp:inline xmlns:a="http://schemas.openxmlformats.org/drawingml/2006/main" xmlns:pic="http://schemas.openxmlformats.org/drawingml/2006/picture">
-            <wp:extent cx="4206240" cy="7495895"/>
+            <wp:extent cx="5120640" cy="9125828"/>
             <wp:docPr id="2" name="Picture 2"/>
             <wp:cNvGraphicFramePr>
               <a:graphicFrameLocks noChangeAspect="1"/>
@@ -2270,7 +2270,7 @@
                   <pic:spPr>
                     <a:xfrm>
                       <a:off x="0" y="0"/>
-                      <a:ext cx="4206240" cy="7495895"/>
+                      <a:ext cx="5120640" cy="9125828"/>
                     </a:xfrm>
                     <a:prstGeom prst="rect"/>
                   </pic:spPr>
@@ -3669,7 +3669,7 @@
       <w:r>
         <w:drawing>
           <wp:inline xmlns:a="http://schemas.openxmlformats.org/drawingml/2006/main" xmlns:pic="http://schemas.openxmlformats.org/drawingml/2006/picture">
-            <wp:extent cx="5486400" cy="2428668"/>
+            <wp:extent cx="5486400" cy="2431433"/>
             <wp:docPr id="4" name="Picture 4"/>
             <wp:cNvGraphicFramePr>
               <a:graphicFrameLocks noChangeAspect="1"/>
@@ -3690,7 +3690,7 @@
                   <pic:spPr>
                     <a:xfrm>
                       <a:off x="0" y="0"/>
-                      <a:ext cx="5486400" cy="2428668"/>
+                      <a:ext cx="5486400" cy="2431433"/>
                     </a:xfrm>
                     <a:prstGeom prst="rect"/>
                   </pic:spPr>
@@ -6884,7 +6884,7 @@
       <w:r>
         <w:drawing>
           <wp:inline xmlns:a="http://schemas.openxmlformats.org/drawingml/2006/main" xmlns:pic="http://schemas.openxmlformats.org/drawingml/2006/picture">
-            <wp:extent cx="5303520" cy="4618607"/>
+            <wp:extent cx="5303520" cy="4614751"/>
             <wp:docPr id="12" name="Picture 12"/>
             <wp:cNvGraphicFramePr>
               <a:graphicFrameLocks noChangeAspect="1"/>
@@ -6905,7 +6905,7 @@
                   <pic:spPr>
                     <a:xfrm>
                       <a:off x="0" y="0"/>
-                      <a:ext cx="5303520" cy="4618607"/>
+                      <a:ext cx="5303520" cy="4614751"/>
                     </a:xfrm>
                     <a:prstGeom prst="rect"/>
                   </pic:spPr>
@@ -8577,7 +8577,7 @@
         <w:ind w:firstLine="720"/>
       </w:pPr>
       <w:r>
-        <w:t>หน้าเว็บ (Gradio) ออกแบบให้มีขั้นตอนเดียว: อัปโหลดหรือวางภาพ ระบบตรวจให้อัตโนมัติ แล้วแสดงการ์ด สรุปผล ภาพผลพร้อมกรอบและป้ายภาษาไทย ตารางรายการตำหนิเรียงตามระดับความเสี่ยง และส่วนขยายแสดงภาพ ผลของ Stage 1 โครงหน้าจอโดยรวมแสดงในภาพต่อไปนี้</w:t>
+        <w:t>หน้าเว็บ (Gradio) ออกแบบให้มีขั้นตอนเดียว เน้นใช้งานง่าย: อัปโหลดหรือวางภาพ ระบบตรวจให้อัตโนมัติ แล้วแสดงการ์ดสรุปผลและตารางรายการตำหนิที่คอลัมน์ขวา ส่วนภาพผลลัพธ์และภาพผลของ Stage 1 แสดงเต็ม ความกว้างด้านล่าง ตัวปรับตั้งค่าทั้งหมด (โมเดล โหมดความไว ค่า confidence โหมดตรวจละเอียด และ Stage 0) ถูกยุบไว้ในส่วน “ตัวเลือกขั้นสูง” โครงหน้าจอโดยรวมแสดงในภาพต่อไปนี้</w:t>
       </w:r>
     </w:p>
     <w:p>
@@ -8588,7 +8588,7 @@
       <w:r>
         <w:drawing>
           <wp:inline xmlns:a="http://schemas.openxmlformats.org/drawingml/2006/main" xmlns:pic="http://schemas.openxmlformats.org/drawingml/2006/picture">
-            <wp:extent cx="5669280" cy="4132783"/>
+            <wp:extent cx="6035040" cy="4471243"/>
             <wp:docPr id="18" name="Picture 18"/>
             <wp:cNvGraphicFramePr>
               <a:graphicFrameLocks noChangeAspect="1"/>
@@ -8597,7 +8597,7 @@
               <a:graphicData uri="http://schemas.openxmlformats.org/drawingml/2006/picture">
                 <pic:pic>
                   <pic:nvPicPr>
-                    <pic:cNvPr id="0" name="ui_wireframe.png"/>
+                    <pic:cNvPr id="0" name="th_wireframe.png"/>
                     <pic:cNvPicPr/>
                   </pic:nvPicPr>
                   <pic:blipFill>
@@ -8609,7 +8609,7 @@
                   <pic:spPr>
                     <a:xfrm>
                       <a:off x="0" y="0"/>
-                      <a:ext cx="5669280" cy="4132783"/>
+                      <a:ext cx="6035040" cy="4471243"/>
                     </a:xfrm>
                     <a:prstGeom prst="rect"/>
                   </pic:spPr>
@@ -8651,7 +8651,7 @@
           <w:b w:val="0"/>
           <w:sz w:val="28"/>
         </w:rPr>
-        <w:t xml:space="preserve">  โครงหน้าจอ (Wireframe) ของหน้าเว็บแสดงผลการตรวจ</w:t>
+        <w:t xml:space="preserve">  โครงหน้าจอ (Wireframe) ของหน้าเว็บระบบ</w:t>
       </w:r>
     </w:p>
     <w:p>
@@ -8660,7 +8660,7 @@
         <w:ind w:firstLine="720"/>
       </w:pPr>
       <w:r>
-        <w:t>ตัวอย่างผลการตรวจจริงของระบบต้นแบบกับตำหนิแต่ละชนิด แสดงในภาพต่อไปนี้ โดยระบบวาดกรอบตำหนิ ป้ายชนิดภาษาไทย และค่าความมั่นใจกำกับ</w:t>
+        <w:t>ตัวอย่างผลการตรวจจริงของระบบต้นแบบกับตำหนิแต่ละชนิด โดยระบบวาดกรอบตำหนิสีแดง ป้ายชนิดภาษาไทย และค่าความมั่นใจกำกับไว้บนภาพ</w:t>
       </w:r>
     </w:p>
     <w:p>
@@ -8671,7 +8671,7 @@
       <w:r>
         <w:drawing>
           <wp:inline xmlns:a="http://schemas.openxmlformats.org/drawingml/2006/main" xmlns:pic="http://schemas.openxmlformats.org/drawingml/2006/picture">
-            <wp:extent cx="4023360" cy="4023360"/>
+            <wp:extent cx="4937760" cy="4937760"/>
             <wp:docPr id="19" name="Picture 19"/>
             <wp:cNvGraphicFramePr>
               <a:graphicFrameLocks noChangeAspect="1"/>
@@ -8692,7 +8692,7 @@
                   <pic:spPr>
                     <a:xfrm>
                       <a:off x="0" y="0"/>
-                      <a:ext cx="4023360" cy="4023360"/>
+                      <a:ext cx="4937760" cy="4937760"/>
                     </a:xfrm>
                     <a:prstGeom prst="rect"/>
                   </pic:spPr>
@@ -8745,7 +8745,7 @@
       <w:r>
         <w:drawing>
           <wp:inline xmlns:a="http://schemas.openxmlformats.org/drawingml/2006/main" xmlns:pic="http://schemas.openxmlformats.org/drawingml/2006/picture">
-            <wp:extent cx="4023360" cy="4023360"/>
+            <wp:extent cx="4937760" cy="4937760"/>
             <wp:docPr id="20" name="Picture 20"/>
             <wp:cNvGraphicFramePr>
               <a:graphicFrameLocks noChangeAspect="1"/>
@@ -8766,7 +8766,7 @@
                   <pic:spPr>
                     <a:xfrm>
                       <a:off x="0" y="0"/>
-                      <a:ext cx="4023360" cy="4023360"/>
+                      <a:ext cx="4937760" cy="4937760"/>
                     </a:xfrm>
                     <a:prstGeom prst="rect"/>
                   </pic:spPr>
@@ -8819,8 +8819,82 @@
       <w:r>
         <w:drawing>
           <wp:inline xmlns:a="http://schemas.openxmlformats.org/drawingml/2006/main" xmlns:pic="http://schemas.openxmlformats.org/drawingml/2006/picture">
-            <wp:extent cx="4206240" cy="7495895"/>
+            <wp:extent cx="4937760" cy="4937760"/>
             <wp:docPr id="21" name="Picture 21"/>
+            <wp:cNvGraphicFramePr>
+              <a:graphicFrameLocks noChangeAspect="1"/>
+            </wp:cNvGraphicFramePr>
+            <a:graphic>
+              <a:graphicData uri="http://schemas.openxmlformats.org/drawingml/2006/picture">
+                <pic:pic>
+                  <pic:nvPicPr>
+                    <pic:cNvPr id="0" name="res_patches.jpg"/>
+                    <pic:cNvPicPr/>
+                  </pic:nvPicPr>
+                  <pic:blipFill>
+                    <a:blip r:embed="rId29"/>
+                    <a:stretch>
+                      <a:fillRect/>
+                    </a:stretch>
+                  </pic:blipFill>
+                  <pic:spPr>
+                    <a:xfrm>
+                      <a:off x="0" y="0"/>
+                      <a:ext cx="4937760" cy="4937760"/>
+                    </a:xfrm>
+                    <a:prstGeom prst="rect"/>
+                  </pic:spPr>
+                </pic:pic>
+              </a:graphicData>
+            </a:graphic>
+          </wp:inline>
+        </w:drawing>
+      </w:r>
+    </w:p>
+    <w:p>
+      <w:pPr>
+        <w:spacing w:after="240" w:before="0"/>
+        <w:jc w:val="center"/>
+      </w:pPr>
+      <w:r>
+        <w:rPr>
+          <w:rFonts w:ascii="TH Sarabun New" w:hAnsi="TH Sarabun New"/>
+          <w:b w:val="0"/>
+          <w:sz w:val="28"/>
+        </w:rPr>
+        <w:t xml:space="preserve">ภาพ </w:t>
+      </w:r>
+      <w:r>
+        <w:rPr>
+          <w:rFonts w:ascii="TH Sarabun New" w:hAnsi="TH Sarabun New"/>
+          <w:b w:val="0"/>
+          <w:sz w:val="28"/>
+        </w:rPr>
+        <w:fldChar w:fldCharType="begin"/>
+        <w:instrText xml:space="preserve"> SEQ ภาพ \* ARABIC </w:instrText>
+        <w:fldChar w:fldCharType="separate"/>
+        <w:t>0</w:t>
+        <w:fldChar w:fldCharType="end"/>
+      </w:r>
+      <w:r>
+        <w:rPr>
+          <w:rFonts w:ascii="TH Sarabun New" w:hAnsi="TH Sarabun New"/>
+          <w:b w:val="0"/>
+          <w:sz w:val="28"/>
+        </w:rPr>
+        <w:t xml:space="preserve">  ตัวอย่างผลการตรวจ — รอยแผ่น/ผิวลอก (patches)</w:t>
+      </w:r>
+    </w:p>
+    <w:p>
+      <w:pPr>
+        <w:spacing w:before="120"/>
+        <w:jc w:val="center"/>
+      </w:pPr>
+      <w:r>
+        <w:drawing>
+          <wp:inline xmlns:a="http://schemas.openxmlformats.org/drawingml/2006/main" xmlns:pic="http://schemas.openxmlformats.org/drawingml/2006/picture">
+            <wp:extent cx="4572000" cy="8148061"/>
+            <wp:docPr id="22" name="Picture 22"/>
             <wp:cNvGraphicFramePr>
               <a:graphicFrameLocks noChangeAspect="1"/>
             </wp:cNvGraphicFramePr>
@@ -8840,7 +8914,7 @@
                   <pic:spPr>
                     <a:xfrm>
                       <a:off x="0" y="0"/>
-                      <a:ext cx="4206240" cy="7495895"/>
+                      <a:ext cx="4572000" cy="8148061"/>
                     </a:xfrm>
                     <a:prstGeom prst="rect"/>
                   </pic:spPr>
@@ -8887,6 +8961,80 @@
     </w:p>
     <w:p>
       <w:pPr>
+        <w:spacing w:before="120"/>
+        <w:jc w:val="center"/>
+      </w:pPr>
+      <w:r>
+        <w:drawing>
+          <wp:inline xmlns:a="http://schemas.openxmlformats.org/drawingml/2006/main" xmlns:pic="http://schemas.openxmlformats.org/drawingml/2006/picture">
+            <wp:extent cx="5486400" cy="3558322"/>
+            <wp:docPr id="23" name="Picture 23"/>
+            <wp:cNvGraphicFramePr>
+              <a:graphicFrameLocks noChangeAspect="1"/>
+            </wp:cNvGraphicFramePr>
+            <a:graphic>
+              <a:graphicData uri="http://schemas.openxmlformats.org/drawingml/2006/picture">
+                <pic:pic>
+                  <pic:nvPicPr>
+                    <pic:cNvPr id="0" name="res_rust2.jpg"/>
+                    <pic:cNvPicPr/>
+                  </pic:nvPicPr>
+                  <pic:blipFill>
+                    <a:blip r:embed="rId30"/>
+                    <a:stretch>
+                      <a:fillRect/>
+                    </a:stretch>
+                  </pic:blipFill>
+                  <pic:spPr>
+                    <a:xfrm>
+                      <a:off x="0" y="0"/>
+                      <a:ext cx="5486400" cy="3558322"/>
+                    </a:xfrm>
+                    <a:prstGeom prst="rect"/>
+                  </pic:spPr>
+                </pic:pic>
+              </a:graphicData>
+            </a:graphic>
+          </wp:inline>
+        </w:drawing>
+      </w:r>
+    </w:p>
+    <w:p>
+      <w:pPr>
+        <w:spacing w:after="240" w:before="0"/>
+        <w:jc w:val="center"/>
+      </w:pPr>
+      <w:r>
+        <w:rPr>
+          <w:rFonts w:ascii="TH Sarabun New" w:hAnsi="TH Sarabun New"/>
+          <w:b w:val="0"/>
+          <w:sz w:val="28"/>
+        </w:rPr>
+        <w:t xml:space="preserve">ภาพ </w:t>
+      </w:r>
+      <w:r>
+        <w:rPr>
+          <w:rFonts w:ascii="TH Sarabun New" w:hAnsi="TH Sarabun New"/>
+          <w:b w:val="0"/>
+          <w:sz w:val="28"/>
+        </w:rPr>
+        <w:fldChar w:fldCharType="begin"/>
+        <w:instrText xml:space="preserve"> SEQ ภาพ \* ARABIC </w:instrText>
+        <w:fldChar w:fldCharType="separate"/>
+        <w:t>0</w:t>
+        <w:fldChar w:fldCharType="end"/>
+      </w:r>
+      <w:r>
+        <w:rPr>
+          <w:rFonts w:ascii="TH Sarabun New" w:hAnsi="TH Sarabun New"/>
+          <w:b w:val="0"/>
+          <w:sz w:val="28"/>
+        </w:rPr>
+        <w:t xml:space="preserve">  ตัวอย่างผลการตรวจ — สนิม (rust) บนท่อเหล็กระดับสถานที่</w:t>
+      </w:r>
+    </w:p>
+    <w:p>
+      <w:pPr>
         <w:spacing w:after="120" w:line="276" w:lineRule="auto"/>
         <w:ind w:firstLine="720"/>
       </w:pPr>
@@ -8902,8 +9050,8 @@
       <w:r>
         <w:drawing>
           <wp:inline xmlns:a="http://schemas.openxmlformats.org/drawingml/2006/main" xmlns:pic="http://schemas.openxmlformats.org/drawingml/2006/picture">
-            <wp:extent cx="4206240" cy="7495895"/>
-            <wp:docPr id="22" name="Picture 22"/>
+            <wp:extent cx="4572000" cy="8148061"/>
+            <wp:docPr id="24" name="Picture 24"/>
             <wp:cNvGraphicFramePr>
               <a:graphicFrameLocks noChangeAspect="1"/>
             </wp:cNvGraphicFramePr>
@@ -8915,7 +9063,7 @@
                     <pic:cNvPicPr/>
                   </pic:nvPicPr>
                   <pic:blipFill>
-                    <a:blip r:embed="rId29"/>
+                    <a:blip r:embed="rId31"/>
                     <a:stretch>
                       <a:fillRect/>
                     </a:stretch>
@@ -8923,7 +9071,7 @@
                   <pic:spPr>
                     <a:xfrm>
                       <a:off x="0" y="0"/>
-                      <a:ext cx="4206240" cy="7495895"/>
+                      <a:ext cx="4572000" cy="8148061"/>
                     </a:xfrm>
                     <a:prstGeom prst="rect"/>
                   </pic:spPr>
@@ -8976,8 +9124,8 @@
       <w:r>
         <w:drawing>
           <wp:inline xmlns:a="http://schemas.openxmlformats.org/drawingml/2006/main" xmlns:pic="http://schemas.openxmlformats.org/drawingml/2006/picture">
-            <wp:extent cx="4206240" cy="7495895"/>
-            <wp:docPr id="23" name="Picture 23"/>
+            <wp:extent cx="4572000" cy="8148061"/>
+            <wp:docPr id="25" name="Picture 25"/>
             <wp:cNvGraphicFramePr>
               <a:graphicFrameLocks noChangeAspect="1"/>
             </wp:cNvGraphicFramePr>
@@ -8985,11 +9133,11 @@
               <a:graphicData uri="http://schemas.openxmlformats.org/drawingml/2006/picture">
                 <pic:pic>
                   <pic:nvPicPr>
-                    <pic:cNvPr id="0" name="res_adapted_model.jpg"/>
+                    <pic:cNvPr id="0" name="res_rust.jpg"/>
                     <pic:cNvPicPr/>
                   </pic:nvPicPr>
                   <pic:blipFill>
-                    <a:blip r:embed="rId30"/>
+                    <a:blip r:embed="rId10"/>
                     <a:stretch>
                       <a:fillRect/>
                     </a:stretch>
@@ -8997,7 +9145,7 @@
                   <pic:spPr>
                     <a:xfrm>
                       <a:off x="0" y="0"/>
-                      <a:ext cx="4206240" cy="7495895"/>
+                      <a:ext cx="4572000" cy="8148061"/>
                     </a:xfrm>
                     <a:prstGeom prst="rect"/>
                   </pic:spPr>
@@ -9078,7 +9226,7 @@
         <w:drawing>
           <wp:inline xmlns:a="http://schemas.openxmlformats.org/drawingml/2006/main" xmlns:pic="http://schemas.openxmlformats.org/drawingml/2006/picture">
             <wp:extent cx="5852160" cy="5252950"/>
-            <wp:docPr id="24" name="Picture 24"/>
+            <wp:docPr id="26" name="Picture 26"/>
             <wp:cNvGraphicFramePr>
               <a:graphicFrameLocks noChangeAspect="1"/>
             </wp:cNvGraphicFramePr>
@@ -9090,7 +9238,7 @@
                     <pic:cNvPicPr/>
                   </pic:nvPicPr>
                   <pic:blipFill>
-                    <a:blip r:embed="rId31"/>
+                    <a:blip r:embed="rId32"/>
                     <a:stretch>
                       <a:fillRect/>
                     </a:stretch>
@@ -12064,7 +12212,7 @@
       </w:r>
     </w:p>
     <w:sectPr>
-      <w:footerReference w:type="default" r:id="rId32"/>
+      <w:footerReference w:type="default" r:id="rId33"/>
       <w:pgSz w:w="12240" w:h="15840"/>
       <w:pgMar w:top="1417" w:right="1134" w:bottom="1417" w:left="1701" w:header="720" w:footer="720" w:gutter="0"/>
       <w:cols w:space="720"/>

</xml_diff>